<commit_message>
adicionando mais coisa pra polir1
</commit_message>
<xml_diff>
--- a/Template_Proposta.docx
+++ b/Template_Proposta.docx
@@ -1229,8 +1229,8 @@
         <w:gridCol w:w="2872"/>
         <w:gridCol w:w="1719"/>
         <w:gridCol w:w="1321"/>
-        <w:gridCol w:w="1254"/>
-        <w:gridCol w:w="1312"/>
+        <w:gridCol w:w="1020"/>
+        <w:gridCol w:w="1546"/>
       </w:tblGrid>
       <w:tr>
         <w:trPr>
@@ -1256,7 +1256,19 @@
               <w:rPr>
                 <w:sz w:val="20"/>
               </w:rPr>
-              <w:t>{{SERVICO}}</w:t>
+              <w:t>{{SERVICO</w:t>
+            </w:r>
+            <w:r>
+              <w:rPr>
+                <w:sz w:val="20"/>
+              </w:rPr>
+              <w:t>_1</w:t>
+            </w:r>
+            <w:r>
+              <w:rPr>
+                <w:sz w:val="20"/>
+              </w:rPr>
+              <w:t>}}</w:t>
             </w:r>
           </w:p>
         </w:tc>
@@ -1277,7 +1289,19 @@
               <w:rPr>
                 <w:sz w:val="20"/>
               </w:rPr>
-              <w:t>{{DESCRICAO}}</w:t>
+              <w:t>{{DESCRICAO</w:t>
+            </w:r>
+            <w:r>
+              <w:rPr>
+                <w:sz w:val="20"/>
+              </w:rPr>
+              <w:t>_1</w:t>
+            </w:r>
+            <w:r>
+              <w:rPr>
+                <w:sz w:val="20"/>
+              </w:rPr>
+              <w:t>}}</w:t>
             </w:r>
           </w:p>
         </w:tc>
@@ -1297,7 +1321,19 @@
               <w:rPr>
                 <w:sz w:val="20"/>
               </w:rPr>
-              <w:t>{{UNIDADE}}</w:t>
+              <w:t>{{UNIDADE</w:t>
+            </w:r>
+            <w:r>
+              <w:rPr>
+                <w:sz w:val="20"/>
+              </w:rPr>
+              <w:t>_1</w:t>
+            </w:r>
+            <w:r>
+              <w:rPr>
+                <w:sz w:val="20"/>
+              </w:rPr>
+              <w:t>}}</w:t>
             </w:r>
           </w:p>
         </w:tc>
@@ -1324,13 +1360,27 @@
                 <w:spacing w:val="-2"/>
                 <w:sz w:val="20"/>
               </w:rPr>
-              <w:t>{{VALOR_UN}}</w:t>
+              <w:t>{{VALOR_UN</w:t>
+            </w:r>
+            <w:r>
+              <w:rPr>
+                <w:spacing w:val="-2"/>
+                <w:sz w:val="20"/>
+              </w:rPr>
+              <w:t>_1</w:t>
+            </w:r>
+            <w:r>
+              <w:rPr>
+                <w:spacing w:val="-2"/>
+                <w:sz w:val="20"/>
+              </w:rPr>
+              <w:t>}}</w:t>
             </w:r>
           </w:p>
         </w:tc>
         <w:tc>
           <w:tcPr>
-            <w:tcW w:w="1254" w:type="dxa"/>
+            <w:tcW w:w="1020" w:type="dxa"/>
           </w:tcPr>
           <w:p>
             <w:pPr>
@@ -1346,13 +1396,27 @@
                 <w:spacing w:val="-5"/>
                 <w:sz w:val="20"/>
               </w:rPr>
-              <w:t>{{QTD}}</w:t>
+              <w:t>{{QTD</w:t>
+            </w:r>
+            <w:r>
+              <w:rPr>
+                <w:spacing w:val="-5"/>
+                <w:sz w:val="20"/>
+              </w:rPr>
+              <w:t>_1</w:t>
+            </w:r>
+            <w:r>
+              <w:rPr>
+                <w:spacing w:val="-5"/>
+                <w:sz w:val="20"/>
+              </w:rPr>
+              <w:t>}}</w:t>
             </w:r>
           </w:p>
         </w:tc>
         <w:tc>
           <w:tcPr>
-            <w:tcW w:w="1312" w:type="dxa"/>
+            <w:tcW w:w="1546" w:type="dxa"/>
             <w:tcBorders>
               <w:right w:val="nil"/>
             </w:tcBorders>
@@ -1376,7 +1440,2120 @@
                 <w:spacing w:val="-2"/>
                 <w:sz w:val="20"/>
               </w:rPr>
-              <w:t>{{VALOR_TOTAL}}</w:t>
+              <w:t>{{VALOR_TOTAL</w:t>
+            </w:r>
+            <w:r>
+              <w:rPr>
+                <w:spacing w:val="-2"/>
+                <w:sz w:val="20"/>
+              </w:rPr>
+              <w:t>_1</w:t>
+            </w:r>
+            <w:r>
+              <w:rPr>
+                <w:spacing w:val="-2"/>
+                <w:sz w:val="20"/>
+              </w:rPr>
+              <w:t>}}</w:t>
+            </w:r>
+          </w:p>
+        </w:tc>
+      </w:tr>
+      <w:tr>
+        <w:trPr>
+          <w:trHeight w:val="1747"/>
+        </w:trPr>
+        <w:tc>
+          <w:tcPr>
+            <w:tcW w:w="1983" w:type="dxa"/>
+            <w:tcBorders>
+              <w:left w:val="nil"/>
+            </w:tcBorders>
+          </w:tcPr>
+          <w:p>
+            <w:pPr>
+              <w:pStyle w:val="TableParagraph"/>
+              <w:ind w:left="196" w:right="224" w:hanging="4"/>
+              <w:jc w:val="center"/>
+              <w:rPr>
+                <w:sz w:val="20"/>
+              </w:rPr>
+            </w:pPr>
+            <w:r>
+              <w:rPr>
+                <w:sz w:val="20"/>
+              </w:rPr>
+              <w:t>{{SERVICO</w:t>
+            </w:r>
+            <w:r>
+              <w:rPr>
+                <w:sz w:val="20"/>
+              </w:rPr>
+              <w:t>_2</w:t>
+            </w:r>
+            <w:r>
+              <w:rPr>
+                <w:sz w:val="20"/>
+              </w:rPr>
+              <w:t>}}</w:t>
+            </w:r>
+          </w:p>
+        </w:tc>
+        <w:tc>
+          <w:tcPr>
+            <w:tcW w:w="2872" w:type="dxa"/>
+          </w:tcPr>
+          <w:p>
+            <w:pPr>
+              <w:pStyle w:val="TableParagraph"/>
+              <w:spacing w:before="0" w:line="227" w:lineRule="exact"/>
+              <w:ind w:left="33"/>
+              <w:rPr>
+                <w:sz w:val="20"/>
+              </w:rPr>
+            </w:pPr>
+            <w:r>
+              <w:rPr>
+                <w:sz w:val="20"/>
+              </w:rPr>
+              <w:t>{{DESCRICAO</w:t>
+            </w:r>
+            <w:r>
+              <w:rPr>
+                <w:sz w:val="20"/>
+              </w:rPr>
+              <w:t>_2</w:t>
+            </w:r>
+            <w:r>
+              <w:rPr>
+                <w:sz w:val="20"/>
+              </w:rPr>
+              <w:t>}}</w:t>
+            </w:r>
+          </w:p>
+        </w:tc>
+        <w:tc>
+          <w:tcPr>
+            <w:tcW w:w="1719" w:type="dxa"/>
+          </w:tcPr>
+          <w:p>
+            <w:pPr>
+              <w:pStyle w:val="TableParagraph"/>
+              <w:ind w:left="340" w:right="324" w:hanging="77"/>
+              <w:rPr>
+                <w:sz w:val="20"/>
+              </w:rPr>
+            </w:pPr>
+            <w:r>
+              <w:rPr>
+                <w:sz w:val="20"/>
+              </w:rPr>
+              <w:t>{{UNIDADE</w:t>
+            </w:r>
+            <w:r>
+              <w:rPr>
+                <w:sz w:val="20"/>
+              </w:rPr>
+              <w:t>_2</w:t>
+            </w:r>
+            <w:r>
+              <w:rPr>
+                <w:sz w:val="20"/>
+              </w:rPr>
+              <w:t>}}</w:t>
+            </w:r>
+          </w:p>
+        </w:tc>
+        <w:tc>
+          <w:tcPr>
+            <w:tcW w:w="1321" w:type="dxa"/>
+          </w:tcPr>
+          <w:p>
+            <w:pPr>
+              <w:pStyle w:val="TableParagraph"/>
+              <w:rPr>
+                <w:spacing w:val="-3"/>
+                <w:sz w:val="20"/>
+              </w:rPr>
+            </w:pPr>
+            <w:r>
+              <w:rPr>
+                <w:spacing w:val="-3"/>
+                <w:sz w:val="20"/>
+              </w:rPr>
+              <w:t xml:space="preserve"> </w:t>
+            </w:r>
+            <w:r>
+              <w:rPr>
+                <w:spacing w:val="-2"/>
+                <w:sz w:val="20"/>
+              </w:rPr>
+              <w:t>{{VALOR_UN</w:t>
+            </w:r>
+            <w:r>
+              <w:rPr>
+                <w:spacing w:val="-2"/>
+                <w:sz w:val="20"/>
+              </w:rPr>
+              <w:t>_2</w:t>
+            </w:r>
+            <w:r>
+              <w:rPr>
+                <w:spacing w:val="-2"/>
+                <w:sz w:val="20"/>
+              </w:rPr>
+              <w:t>}}</w:t>
+            </w:r>
+          </w:p>
+        </w:tc>
+        <w:tc>
+          <w:tcPr>
+            <w:tcW w:w="1020" w:type="dxa"/>
+          </w:tcPr>
+          <w:p>
+            <w:pPr>
+              <w:pStyle w:val="TableParagraph"/>
+              <w:ind w:left="41"/>
+              <w:jc w:val="center"/>
+              <w:rPr>
+                <w:spacing w:val="-5"/>
+                <w:sz w:val="20"/>
+              </w:rPr>
+            </w:pPr>
+            <w:r>
+              <w:rPr>
+                <w:spacing w:val="-5"/>
+                <w:sz w:val="20"/>
+              </w:rPr>
+              <w:t>{{QTD</w:t>
+            </w:r>
+            <w:r>
+              <w:rPr>
+                <w:spacing w:val="-5"/>
+                <w:sz w:val="20"/>
+              </w:rPr>
+              <w:t>_2</w:t>
+            </w:r>
+            <w:r>
+              <w:rPr>
+                <w:spacing w:val="-5"/>
+                <w:sz w:val="20"/>
+              </w:rPr>
+              <w:t>}}</w:t>
+            </w:r>
+          </w:p>
+        </w:tc>
+        <w:tc>
+          <w:tcPr>
+            <w:tcW w:w="1546" w:type="dxa"/>
+            <w:tcBorders>
+              <w:right w:val="nil"/>
+            </w:tcBorders>
+          </w:tcPr>
+          <w:p>
+            <w:pPr>
+              <w:pStyle w:val="TableParagraph"/>
+              <w:rPr>
+                <w:spacing w:val="-1"/>
+                <w:sz w:val="20"/>
+              </w:rPr>
+            </w:pPr>
+            <w:r>
+              <w:rPr>
+                <w:spacing w:val="-1"/>
+                <w:sz w:val="20"/>
+              </w:rPr>
+              <w:t xml:space="preserve"> </w:t>
+            </w:r>
+            <w:r>
+              <w:rPr>
+                <w:spacing w:val="-2"/>
+                <w:sz w:val="20"/>
+              </w:rPr>
+              <w:t>{{VALOR_TOTAL</w:t>
+            </w:r>
+            <w:r>
+              <w:rPr>
+                <w:spacing w:val="-2"/>
+                <w:sz w:val="20"/>
+              </w:rPr>
+              <w:t>_2</w:t>
+            </w:r>
+            <w:r>
+              <w:rPr>
+                <w:spacing w:val="-2"/>
+                <w:sz w:val="20"/>
+              </w:rPr>
+              <w:t>}}</w:t>
+            </w:r>
+          </w:p>
+        </w:tc>
+      </w:tr>
+      <w:tr>
+        <w:trPr>
+          <w:trHeight w:val="1747"/>
+        </w:trPr>
+        <w:tc>
+          <w:tcPr>
+            <w:tcW w:w="1983" w:type="dxa"/>
+            <w:tcBorders>
+              <w:left w:val="nil"/>
+            </w:tcBorders>
+          </w:tcPr>
+          <w:p>
+            <w:pPr>
+              <w:pStyle w:val="TableParagraph"/>
+              <w:ind w:left="196" w:right="224" w:hanging="4"/>
+              <w:jc w:val="center"/>
+              <w:rPr>
+                <w:sz w:val="20"/>
+              </w:rPr>
+            </w:pPr>
+            <w:r>
+              <w:rPr>
+                <w:sz w:val="20"/>
+              </w:rPr>
+              <w:t>{{SERVICO</w:t>
+            </w:r>
+            <w:r>
+              <w:rPr>
+                <w:sz w:val="20"/>
+              </w:rPr>
+              <w:t>_3</w:t>
+            </w:r>
+            <w:r>
+              <w:rPr>
+                <w:sz w:val="20"/>
+              </w:rPr>
+              <w:t>}}</w:t>
+            </w:r>
+          </w:p>
+        </w:tc>
+        <w:tc>
+          <w:tcPr>
+            <w:tcW w:w="2872" w:type="dxa"/>
+          </w:tcPr>
+          <w:p>
+            <w:pPr>
+              <w:pStyle w:val="TableParagraph"/>
+              <w:spacing w:before="0" w:line="227" w:lineRule="exact"/>
+              <w:ind w:left="33"/>
+              <w:rPr>
+                <w:sz w:val="20"/>
+              </w:rPr>
+            </w:pPr>
+            <w:r>
+              <w:rPr>
+                <w:sz w:val="20"/>
+              </w:rPr>
+              <w:t>{{DESCRICAO</w:t>
+            </w:r>
+            <w:r>
+              <w:rPr>
+                <w:sz w:val="20"/>
+              </w:rPr>
+              <w:t>_3</w:t>
+            </w:r>
+            <w:r>
+              <w:rPr>
+                <w:sz w:val="20"/>
+              </w:rPr>
+              <w:t>}}</w:t>
+            </w:r>
+          </w:p>
+        </w:tc>
+        <w:tc>
+          <w:tcPr>
+            <w:tcW w:w="1719" w:type="dxa"/>
+          </w:tcPr>
+          <w:p>
+            <w:pPr>
+              <w:pStyle w:val="TableParagraph"/>
+              <w:ind w:left="340" w:right="324" w:hanging="77"/>
+              <w:rPr>
+                <w:sz w:val="20"/>
+              </w:rPr>
+            </w:pPr>
+            <w:r>
+              <w:rPr>
+                <w:sz w:val="20"/>
+              </w:rPr>
+              <w:t>{{UNIDADE</w:t>
+            </w:r>
+            <w:r>
+              <w:rPr>
+                <w:sz w:val="20"/>
+              </w:rPr>
+              <w:t>_3</w:t>
+            </w:r>
+            <w:r>
+              <w:rPr>
+                <w:sz w:val="20"/>
+              </w:rPr>
+              <w:t>}}</w:t>
+            </w:r>
+          </w:p>
+        </w:tc>
+        <w:tc>
+          <w:tcPr>
+            <w:tcW w:w="1321" w:type="dxa"/>
+          </w:tcPr>
+          <w:p>
+            <w:pPr>
+              <w:pStyle w:val="TableParagraph"/>
+              <w:rPr>
+                <w:spacing w:val="-3"/>
+                <w:sz w:val="20"/>
+              </w:rPr>
+            </w:pPr>
+            <w:r>
+              <w:rPr>
+                <w:spacing w:val="-3"/>
+                <w:sz w:val="20"/>
+              </w:rPr>
+              <w:t xml:space="preserve"> </w:t>
+            </w:r>
+            <w:r>
+              <w:rPr>
+                <w:spacing w:val="-2"/>
+                <w:sz w:val="20"/>
+              </w:rPr>
+              <w:t>{{VALOR_UN</w:t>
+            </w:r>
+            <w:r>
+              <w:rPr>
+                <w:spacing w:val="-2"/>
+                <w:sz w:val="20"/>
+              </w:rPr>
+              <w:t>_3</w:t>
+            </w:r>
+            <w:r>
+              <w:rPr>
+                <w:spacing w:val="-2"/>
+                <w:sz w:val="20"/>
+              </w:rPr>
+              <w:t>}}</w:t>
+            </w:r>
+          </w:p>
+        </w:tc>
+        <w:tc>
+          <w:tcPr>
+            <w:tcW w:w="1020" w:type="dxa"/>
+          </w:tcPr>
+          <w:p>
+            <w:pPr>
+              <w:pStyle w:val="TableParagraph"/>
+              <w:ind w:left="41"/>
+              <w:jc w:val="center"/>
+              <w:rPr>
+                <w:spacing w:val="-5"/>
+                <w:sz w:val="20"/>
+              </w:rPr>
+            </w:pPr>
+            <w:r>
+              <w:rPr>
+                <w:spacing w:val="-5"/>
+                <w:sz w:val="20"/>
+              </w:rPr>
+              <w:t>{{QTD</w:t>
+            </w:r>
+            <w:r>
+              <w:rPr>
+                <w:spacing w:val="-5"/>
+                <w:sz w:val="20"/>
+              </w:rPr>
+              <w:t>_3</w:t>
+            </w:r>
+            <w:r>
+              <w:rPr>
+                <w:spacing w:val="-5"/>
+                <w:sz w:val="20"/>
+              </w:rPr>
+              <w:t>}}</w:t>
+            </w:r>
+          </w:p>
+        </w:tc>
+        <w:tc>
+          <w:tcPr>
+            <w:tcW w:w="1546" w:type="dxa"/>
+            <w:tcBorders>
+              <w:right w:val="nil"/>
+            </w:tcBorders>
+          </w:tcPr>
+          <w:p>
+            <w:pPr>
+              <w:pStyle w:val="TableParagraph"/>
+              <w:rPr>
+                <w:spacing w:val="-1"/>
+                <w:sz w:val="20"/>
+              </w:rPr>
+            </w:pPr>
+            <w:r>
+              <w:rPr>
+                <w:spacing w:val="-1"/>
+                <w:sz w:val="20"/>
+              </w:rPr>
+              <w:t xml:space="preserve"> </w:t>
+            </w:r>
+            <w:r>
+              <w:rPr>
+                <w:spacing w:val="-2"/>
+                <w:sz w:val="20"/>
+              </w:rPr>
+              <w:t>{{VALOR_TOTAL</w:t>
+            </w:r>
+            <w:r>
+              <w:rPr>
+                <w:spacing w:val="-2"/>
+                <w:sz w:val="20"/>
+              </w:rPr>
+              <w:t>_3</w:t>
+            </w:r>
+            <w:r>
+              <w:rPr>
+                <w:spacing w:val="-2"/>
+                <w:sz w:val="20"/>
+              </w:rPr>
+              <w:t>}}</w:t>
+            </w:r>
+          </w:p>
+        </w:tc>
+      </w:tr>
+      <w:tr>
+        <w:trPr>
+          <w:trHeight w:val="1747"/>
+        </w:trPr>
+        <w:tc>
+          <w:tcPr>
+            <w:tcW w:w="1983" w:type="dxa"/>
+            <w:tcBorders>
+              <w:left w:val="nil"/>
+            </w:tcBorders>
+          </w:tcPr>
+          <w:p>
+            <w:pPr>
+              <w:pStyle w:val="TableParagraph"/>
+              <w:ind w:left="196" w:right="224" w:hanging="4"/>
+              <w:jc w:val="center"/>
+              <w:rPr>
+                <w:sz w:val="20"/>
+              </w:rPr>
+            </w:pPr>
+            <w:r>
+              <w:rPr>
+                <w:sz w:val="20"/>
+              </w:rPr>
+              <w:lastRenderedPageBreak/>
+              <w:t>{{SERVICO</w:t>
+            </w:r>
+            <w:r>
+              <w:rPr>
+                <w:sz w:val="20"/>
+              </w:rPr>
+              <w:t>_4</w:t>
+            </w:r>
+            <w:r>
+              <w:rPr>
+                <w:sz w:val="20"/>
+              </w:rPr>
+              <w:t>}}</w:t>
+            </w:r>
+          </w:p>
+        </w:tc>
+        <w:tc>
+          <w:tcPr>
+            <w:tcW w:w="2872" w:type="dxa"/>
+          </w:tcPr>
+          <w:p>
+            <w:pPr>
+              <w:pStyle w:val="TableParagraph"/>
+              <w:spacing w:before="0" w:line="227" w:lineRule="exact"/>
+              <w:ind w:left="33"/>
+              <w:rPr>
+                <w:sz w:val="20"/>
+              </w:rPr>
+            </w:pPr>
+            <w:r>
+              <w:rPr>
+                <w:sz w:val="20"/>
+              </w:rPr>
+              <w:t>{{DESCRICAO</w:t>
+            </w:r>
+            <w:r>
+              <w:rPr>
+                <w:sz w:val="20"/>
+              </w:rPr>
+              <w:t>_4</w:t>
+            </w:r>
+            <w:r>
+              <w:rPr>
+                <w:sz w:val="20"/>
+              </w:rPr>
+              <w:t>}}</w:t>
+            </w:r>
+          </w:p>
+        </w:tc>
+        <w:tc>
+          <w:tcPr>
+            <w:tcW w:w="1719" w:type="dxa"/>
+          </w:tcPr>
+          <w:p>
+            <w:pPr>
+              <w:pStyle w:val="TableParagraph"/>
+              <w:ind w:left="340" w:right="324" w:hanging="77"/>
+              <w:rPr>
+                <w:sz w:val="20"/>
+              </w:rPr>
+            </w:pPr>
+            <w:r>
+              <w:rPr>
+                <w:sz w:val="20"/>
+              </w:rPr>
+              <w:t>{{UNIDADE</w:t>
+            </w:r>
+            <w:r>
+              <w:rPr>
+                <w:sz w:val="20"/>
+              </w:rPr>
+              <w:t>_4</w:t>
+            </w:r>
+            <w:r>
+              <w:rPr>
+                <w:sz w:val="20"/>
+              </w:rPr>
+              <w:t>}}</w:t>
+            </w:r>
+          </w:p>
+        </w:tc>
+        <w:tc>
+          <w:tcPr>
+            <w:tcW w:w="1321" w:type="dxa"/>
+          </w:tcPr>
+          <w:p>
+            <w:pPr>
+              <w:pStyle w:val="TableParagraph"/>
+              <w:rPr>
+                <w:spacing w:val="-3"/>
+                <w:sz w:val="20"/>
+              </w:rPr>
+            </w:pPr>
+            <w:r>
+              <w:rPr>
+                <w:spacing w:val="-3"/>
+                <w:sz w:val="20"/>
+              </w:rPr>
+              <w:t xml:space="preserve"> </w:t>
+            </w:r>
+            <w:r>
+              <w:rPr>
+                <w:spacing w:val="-2"/>
+                <w:sz w:val="20"/>
+              </w:rPr>
+              <w:t>{{VALOR_UN</w:t>
+            </w:r>
+            <w:r>
+              <w:rPr>
+                <w:spacing w:val="-2"/>
+                <w:sz w:val="20"/>
+              </w:rPr>
+              <w:t>_4</w:t>
+            </w:r>
+            <w:r>
+              <w:rPr>
+                <w:spacing w:val="-2"/>
+                <w:sz w:val="20"/>
+              </w:rPr>
+              <w:t>}}</w:t>
+            </w:r>
+          </w:p>
+        </w:tc>
+        <w:tc>
+          <w:tcPr>
+            <w:tcW w:w="1020" w:type="dxa"/>
+          </w:tcPr>
+          <w:p>
+            <w:pPr>
+              <w:pStyle w:val="TableParagraph"/>
+              <w:ind w:left="41"/>
+              <w:jc w:val="center"/>
+              <w:rPr>
+                <w:spacing w:val="-5"/>
+                <w:sz w:val="20"/>
+              </w:rPr>
+            </w:pPr>
+            <w:r>
+              <w:rPr>
+                <w:spacing w:val="-5"/>
+                <w:sz w:val="20"/>
+              </w:rPr>
+              <w:t>{{QTD</w:t>
+            </w:r>
+            <w:r>
+              <w:rPr>
+                <w:spacing w:val="-5"/>
+                <w:sz w:val="20"/>
+              </w:rPr>
+              <w:t>_4</w:t>
+            </w:r>
+            <w:r>
+              <w:rPr>
+                <w:spacing w:val="-5"/>
+                <w:sz w:val="20"/>
+              </w:rPr>
+              <w:t>}}</w:t>
+            </w:r>
+          </w:p>
+        </w:tc>
+        <w:tc>
+          <w:tcPr>
+            <w:tcW w:w="1546" w:type="dxa"/>
+            <w:tcBorders>
+              <w:right w:val="nil"/>
+            </w:tcBorders>
+          </w:tcPr>
+          <w:p>
+            <w:pPr>
+              <w:pStyle w:val="TableParagraph"/>
+              <w:rPr>
+                <w:spacing w:val="-1"/>
+                <w:sz w:val="20"/>
+              </w:rPr>
+            </w:pPr>
+            <w:r>
+              <w:rPr>
+                <w:spacing w:val="-1"/>
+                <w:sz w:val="20"/>
+              </w:rPr>
+              <w:t xml:space="preserve"> </w:t>
+            </w:r>
+            <w:r>
+              <w:rPr>
+                <w:spacing w:val="-2"/>
+                <w:sz w:val="20"/>
+              </w:rPr>
+              <w:t>{{VALOR_TOTAL</w:t>
+            </w:r>
+            <w:r>
+              <w:rPr>
+                <w:spacing w:val="-2"/>
+                <w:sz w:val="20"/>
+              </w:rPr>
+              <w:t>_4</w:t>
+            </w:r>
+            <w:r>
+              <w:rPr>
+                <w:spacing w:val="-2"/>
+                <w:sz w:val="20"/>
+              </w:rPr>
+              <w:t>}}</w:t>
+            </w:r>
+          </w:p>
+        </w:tc>
+      </w:tr>
+      <w:tr>
+        <w:trPr>
+          <w:trHeight w:val="1747"/>
+        </w:trPr>
+        <w:tc>
+          <w:tcPr>
+            <w:tcW w:w="1983" w:type="dxa"/>
+            <w:tcBorders>
+              <w:left w:val="nil"/>
+            </w:tcBorders>
+          </w:tcPr>
+          <w:p>
+            <w:pPr>
+              <w:pStyle w:val="TableParagraph"/>
+              <w:ind w:left="196" w:right="224" w:hanging="4"/>
+              <w:jc w:val="center"/>
+              <w:rPr>
+                <w:sz w:val="20"/>
+              </w:rPr>
+            </w:pPr>
+            <w:r>
+              <w:rPr>
+                <w:sz w:val="20"/>
+              </w:rPr>
+              <w:t>{{SERVICO</w:t>
+            </w:r>
+            <w:r>
+              <w:rPr>
+                <w:sz w:val="20"/>
+              </w:rPr>
+              <w:t>_5</w:t>
+            </w:r>
+            <w:r>
+              <w:rPr>
+                <w:sz w:val="20"/>
+              </w:rPr>
+              <w:t>}}</w:t>
+            </w:r>
+          </w:p>
+        </w:tc>
+        <w:tc>
+          <w:tcPr>
+            <w:tcW w:w="2872" w:type="dxa"/>
+          </w:tcPr>
+          <w:p>
+            <w:pPr>
+              <w:pStyle w:val="TableParagraph"/>
+              <w:spacing w:before="0" w:line="227" w:lineRule="exact"/>
+              <w:ind w:left="33"/>
+              <w:rPr>
+                <w:sz w:val="20"/>
+              </w:rPr>
+            </w:pPr>
+            <w:r>
+              <w:rPr>
+                <w:sz w:val="20"/>
+              </w:rPr>
+              <w:t>{{DESCRICAO</w:t>
+            </w:r>
+            <w:r>
+              <w:rPr>
+                <w:sz w:val="20"/>
+              </w:rPr>
+              <w:t>_5</w:t>
+            </w:r>
+            <w:r>
+              <w:rPr>
+                <w:sz w:val="20"/>
+              </w:rPr>
+              <w:t>}}</w:t>
+            </w:r>
+          </w:p>
+        </w:tc>
+        <w:tc>
+          <w:tcPr>
+            <w:tcW w:w="1719" w:type="dxa"/>
+          </w:tcPr>
+          <w:p>
+            <w:pPr>
+              <w:pStyle w:val="TableParagraph"/>
+              <w:ind w:left="340" w:right="324" w:hanging="77"/>
+              <w:rPr>
+                <w:sz w:val="20"/>
+              </w:rPr>
+            </w:pPr>
+            <w:r>
+              <w:rPr>
+                <w:sz w:val="20"/>
+              </w:rPr>
+              <w:t>{{UNIDADE</w:t>
+            </w:r>
+            <w:r>
+              <w:rPr>
+                <w:sz w:val="20"/>
+              </w:rPr>
+              <w:t>_5</w:t>
+            </w:r>
+            <w:r>
+              <w:rPr>
+                <w:sz w:val="20"/>
+              </w:rPr>
+              <w:t>}}</w:t>
+            </w:r>
+          </w:p>
+        </w:tc>
+        <w:tc>
+          <w:tcPr>
+            <w:tcW w:w="1321" w:type="dxa"/>
+          </w:tcPr>
+          <w:p>
+            <w:pPr>
+              <w:pStyle w:val="TableParagraph"/>
+              <w:rPr>
+                <w:spacing w:val="-3"/>
+                <w:sz w:val="20"/>
+              </w:rPr>
+            </w:pPr>
+            <w:r>
+              <w:rPr>
+                <w:spacing w:val="-3"/>
+                <w:sz w:val="20"/>
+              </w:rPr>
+              <w:t xml:space="preserve"> </w:t>
+            </w:r>
+            <w:r>
+              <w:rPr>
+                <w:spacing w:val="-2"/>
+                <w:sz w:val="20"/>
+              </w:rPr>
+              <w:t>{{VALOR_UN</w:t>
+            </w:r>
+            <w:r>
+              <w:rPr>
+                <w:spacing w:val="-2"/>
+                <w:sz w:val="20"/>
+              </w:rPr>
+              <w:t>_5</w:t>
+            </w:r>
+            <w:r>
+              <w:rPr>
+                <w:spacing w:val="-2"/>
+                <w:sz w:val="20"/>
+              </w:rPr>
+              <w:t>}}</w:t>
+            </w:r>
+          </w:p>
+        </w:tc>
+        <w:tc>
+          <w:tcPr>
+            <w:tcW w:w="1020" w:type="dxa"/>
+          </w:tcPr>
+          <w:p>
+            <w:pPr>
+              <w:pStyle w:val="TableParagraph"/>
+              <w:ind w:left="41"/>
+              <w:jc w:val="center"/>
+              <w:rPr>
+                <w:spacing w:val="-5"/>
+                <w:sz w:val="20"/>
+              </w:rPr>
+            </w:pPr>
+            <w:r>
+              <w:rPr>
+                <w:spacing w:val="-5"/>
+                <w:sz w:val="20"/>
+              </w:rPr>
+              <w:t>{{QTD</w:t>
+            </w:r>
+            <w:r>
+              <w:rPr>
+                <w:spacing w:val="-5"/>
+                <w:sz w:val="20"/>
+              </w:rPr>
+              <w:t>_5</w:t>
+            </w:r>
+            <w:r>
+              <w:rPr>
+                <w:spacing w:val="-5"/>
+                <w:sz w:val="20"/>
+              </w:rPr>
+              <w:t>}}</w:t>
+            </w:r>
+          </w:p>
+        </w:tc>
+        <w:tc>
+          <w:tcPr>
+            <w:tcW w:w="1546" w:type="dxa"/>
+            <w:tcBorders>
+              <w:right w:val="nil"/>
+            </w:tcBorders>
+          </w:tcPr>
+          <w:p>
+            <w:pPr>
+              <w:pStyle w:val="TableParagraph"/>
+              <w:rPr>
+                <w:spacing w:val="-1"/>
+                <w:sz w:val="20"/>
+              </w:rPr>
+            </w:pPr>
+            <w:r>
+              <w:rPr>
+                <w:spacing w:val="-1"/>
+                <w:sz w:val="20"/>
+              </w:rPr>
+              <w:t xml:space="preserve"> </w:t>
+            </w:r>
+            <w:r>
+              <w:rPr>
+                <w:spacing w:val="-2"/>
+                <w:sz w:val="20"/>
+              </w:rPr>
+              <w:t>{{VALOR_TOTAL</w:t>
+            </w:r>
+            <w:r>
+              <w:rPr>
+                <w:spacing w:val="-2"/>
+                <w:sz w:val="20"/>
+              </w:rPr>
+              <w:t>_5</w:t>
+            </w:r>
+            <w:r>
+              <w:rPr>
+                <w:spacing w:val="-2"/>
+                <w:sz w:val="20"/>
+              </w:rPr>
+              <w:t>}}</w:t>
+            </w:r>
+          </w:p>
+        </w:tc>
+      </w:tr>
+      <w:tr>
+        <w:trPr>
+          <w:trHeight w:val="1747"/>
+        </w:trPr>
+        <w:tc>
+          <w:tcPr>
+            <w:tcW w:w="1983" w:type="dxa"/>
+            <w:tcBorders>
+              <w:left w:val="nil"/>
+            </w:tcBorders>
+          </w:tcPr>
+          <w:p>
+            <w:pPr>
+              <w:pStyle w:val="TableParagraph"/>
+              <w:ind w:left="196" w:right="224" w:hanging="4"/>
+              <w:jc w:val="center"/>
+              <w:rPr>
+                <w:sz w:val="20"/>
+              </w:rPr>
+            </w:pPr>
+            <w:r>
+              <w:rPr>
+                <w:sz w:val="20"/>
+              </w:rPr>
+              <w:t>{{SERVICO</w:t>
+            </w:r>
+            <w:r>
+              <w:rPr>
+                <w:sz w:val="20"/>
+              </w:rPr>
+              <w:t>_6</w:t>
+            </w:r>
+            <w:r>
+              <w:rPr>
+                <w:sz w:val="20"/>
+              </w:rPr>
+              <w:t>}}</w:t>
+            </w:r>
+          </w:p>
+        </w:tc>
+        <w:tc>
+          <w:tcPr>
+            <w:tcW w:w="2872" w:type="dxa"/>
+          </w:tcPr>
+          <w:p>
+            <w:pPr>
+              <w:pStyle w:val="TableParagraph"/>
+              <w:spacing w:before="0" w:line="227" w:lineRule="exact"/>
+              <w:ind w:left="33"/>
+              <w:rPr>
+                <w:sz w:val="20"/>
+              </w:rPr>
+            </w:pPr>
+            <w:r>
+              <w:rPr>
+                <w:sz w:val="20"/>
+              </w:rPr>
+              <w:t>{{DESCRICAO</w:t>
+            </w:r>
+            <w:r>
+              <w:rPr>
+                <w:sz w:val="20"/>
+              </w:rPr>
+              <w:t>_6</w:t>
+            </w:r>
+            <w:r>
+              <w:rPr>
+                <w:sz w:val="20"/>
+              </w:rPr>
+              <w:t>}}</w:t>
+            </w:r>
+          </w:p>
+        </w:tc>
+        <w:tc>
+          <w:tcPr>
+            <w:tcW w:w="1719" w:type="dxa"/>
+          </w:tcPr>
+          <w:p>
+            <w:pPr>
+              <w:pStyle w:val="TableParagraph"/>
+              <w:ind w:left="340" w:right="324" w:hanging="77"/>
+              <w:rPr>
+                <w:sz w:val="20"/>
+              </w:rPr>
+            </w:pPr>
+            <w:r>
+              <w:rPr>
+                <w:sz w:val="20"/>
+              </w:rPr>
+              <w:t>{{UNIDADE</w:t>
+            </w:r>
+            <w:r>
+              <w:rPr>
+                <w:sz w:val="20"/>
+              </w:rPr>
+              <w:t>_6</w:t>
+            </w:r>
+            <w:r>
+              <w:rPr>
+                <w:sz w:val="20"/>
+              </w:rPr>
+              <w:t>}}</w:t>
+            </w:r>
+          </w:p>
+        </w:tc>
+        <w:tc>
+          <w:tcPr>
+            <w:tcW w:w="1321" w:type="dxa"/>
+          </w:tcPr>
+          <w:p>
+            <w:pPr>
+              <w:pStyle w:val="TableParagraph"/>
+              <w:rPr>
+                <w:spacing w:val="-3"/>
+                <w:sz w:val="20"/>
+              </w:rPr>
+            </w:pPr>
+            <w:r>
+              <w:rPr>
+                <w:spacing w:val="-3"/>
+                <w:sz w:val="20"/>
+              </w:rPr>
+              <w:t xml:space="preserve"> </w:t>
+            </w:r>
+            <w:r>
+              <w:rPr>
+                <w:spacing w:val="-2"/>
+                <w:sz w:val="20"/>
+              </w:rPr>
+              <w:t>{{VALOR_UN</w:t>
+            </w:r>
+            <w:r>
+              <w:rPr>
+                <w:spacing w:val="-2"/>
+                <w:sz w:val="20"/>
+              </w:rPr>
+              <w:t>_6</w:t>
+            </w:r>
+            <w:r>
+              <w:rPr>
+                <w:spacing w:val="-2"/>
+                <w:sz w:val="20"/>
+              </w:rPr>
+              <w:t>}}</w:t>
+            </w:r>
+          </w:p>
+        </w:tc>
+        <w:tc>
+          <w:tcPr>
+            <w:tcW w:w="1020" w:type="dxa"/>
+          </w:tcPr>
+          <w:p>
+            <w:pPr>
+              <w:pStyle w:val="TableParagraph"/>
+              <w:ind w:left="41"/>
+              <w:jc w:val="center"/>
+              <w:rPr>
+                <w:spacing w:val="-5"/>
+                <w:sz w:val="20"/>
+              </w:rPr>
+            </w:pPr>
+            <w:r>
+              <w:rPr>
+                <w:spacing w:val="-5"/>
+                <w:sz w:val="20"/>
+              </w:rPr>
+              <w:t>{{QTD</w:t>
+            </w:r>
+            <w:r>
+              <w:rPr>
+                <w:spacing w:val="-5"/>
+                <w:sz w:val="20"/>
+              </w:rPr>
+              <w:t>_6</w:t>
+            </w:r>
+            <w:r>
+              <w:rPr>
+                <w:spacing w:val="-5"/>
+                <w:sz w:val="20"/>
+              </w:rPr>
+              <w:t>}}</w:t>
+            </w:r>
+          </w:p>
+        </w:tc>
+        <w:tc>
+          <w:tcPr>
+            <w:tcW w:w="1546" w:type="dxa"/>
+            <w:tcBorders>
+              <w:right w:val="nil"/>
+            </w:tcBorders>
+          </w:tcPr>
+          <w:p>
+            <w:pPr>
+              <w:pStyle w:val="TableParagraph"/>
+              <w:rPr>
+                <w:spacing w:val="-1"/>
+                <w:sz w:val="20"/>
+              </w:rPr>
+            </w:pPr>
+            <w:r>
+              <w:rPr>
+                <w:spacing w:val="-1"/>
+                <w:sz w:val="20"/>
+              </w:rPr>
+              <w:t xml:space="preserve"> </w:t>
+            </w:r>
+            <w:r>
+              <w:rPr>
+                <w:spacing w:val="-2"/>
+                <w:sz w:val="20"/>
+              </w:rPr>
+              <w:t>{{VALOR_TOTAL</w:t>
+            </w:r>
+            <w:r>
+              <w:rPr>
+                <w:spacing w:val="-2"/>
+                <w:sz w:val="20"/>
+              </w:rPr>
+              <w:t>_6</w:t>
+            </w:r>
+            <w:r>
+              <w:rPr>
+                <w:spacing w:val="-2"/>
+                <w:sz w:val="20"/>
+              </w:rPr>
+              <w:t>}}</w:t>
+            </w:r>
+          </w:p>
+        </w:tc>
+      </w:tr>
+      <w:tr>
+        <w:trPr>
+          <w:trHeight w:val="1747"/>
+        </w:trPr>
+        <w:tc>
+          <w:tcPr>
+            <w:tcW w:w="1983" w:type="dxa"/>
+            <w:tcBorders>
+              <w:left w:val="nil"/>
+            </w:tcBorders>
+          </w:tcPr>
+          <w:p>
+            <w:pPr>
+              <w:pStyle w:val="TableParagraph"/>
+              <w:ind w:left="196" w:right="224" w:hanging="4"/>
+              <w:jc w:val="center"/>
+              <w:rPr>
+                <w:sz w:val="20"/>
+              </w:rPr>
+            </w:pPr>
+            <w:r>
+              <w:rPr>
+                <w:sz w:val="20"/>
+              </w:rPr>
+              <w:t>{{SERVICO</w:t>
+            </w:r>
+            <w:r>
+              <w:rPr>
+                <w:sz w:val="20"/>
+              </w:rPr>
+              <w:t>_7</w:t>
+            </w:r>
+            <w:r>
+              <w:rPr>
+                <w:sz w:val="20"/>
+              </w:rPr>
+              <w:t>}}</w:t>
+            </w:r>
+          </w:p>
+        </w:tc>
+        <w:tc>
+          <w:tcPr>
+            <w:tcW w:w="2872" w:type="dxa"/>
+          </w:tcPr>
+          <w:p>
+            <w:pPr>
+              <w:pStyle w:val="TableParagraph"/>
+              <w:spacing w:before="0" w:line="227" w:lineRule="exact"/>
+              <w:ind w:left="33"/>
+              <w:rPr>
+                <w:sz w:val="20"/>
+              </w:rPr>
+            </w:pPr>
+            <w:r>
+              <w:rPr>
+                <w:sz w:val="20"/>
+              </w:rPr>
+              <w:t>{{DESCRICAO</w:t>
+            </w:r>
+            <w:r>
+              <w:rPr>
+                <w:sz w:val="20"/>
+              </w:rPr>
+              <w:t>_7</w:t>
+            </w:r>
+            <w:r>
+              <w:rPr>
+                <w:sz w:val="20"/>
+              </w:rPr>
+              <w:t>}}</w:t>
+            </w:r>
+          </w:p>
+        </w:tc>
+        <w:tc>
+          <w:tcPr>
+            <w:tcW w:w="1719" w:type="dxa"/>
+          </w:tcPr>
+          <w:p>
+            <w:pPr>
+              <w:pStyle w:val="TableParagraph"/>
+              <w:ind w:left="340" w:right="324" w:hanging="77"/>
+              <w:rPr>
+                <w:sz w:val="20"/>
+              </w:rPr>
+            </w:pPr>
+            <w:r>
+              <w:rPr>
+                <w:sz w:val="20"/>
+              </w:rPr>
+              <w:t>{{UNIDADE</w:t>
+            </w:r>
+            <w:r>
+              <w:rPr>
+                <w:sz w:val="20"/>
+              </w:rPr>
+              <w:t>_7</w:t>
+            </w:r>
+            <w:r>
+              <w:rPr>
+                <w:sz w:val="20"/>
+              </w:rPr>
+              <w:t>}}</w:t>
+            </w:r>
+          </w:p>
+        </w:tc>
+        <w:tc>
+          <w:tcPr>
+            <w:tcW w:w="1321" w:type="dxa"/>
+          </w:tcPr>
+          <w:p>
+            <w:pPr>
+              <w:pStyle w:val="TableParagraph"/>
+              <w:rPr>
+                <w:spacing w:val="-3"/>
+                <w:sz w:val="20"/>
+              </w:rPr>
+            </w:pPr>
+            <w:r>
+              <w:rPr>
+                <w:spacing w:val="-3"/>
+                <w:sz w:val="20"/>
+              </w:rPr>
+              <w:t xml:space="preserve"> </w:t>
+            </w:r>
+            <w:r>
+              <w:rPr>
+                <w:spacing w:val="-2"/>
+                <w:sz w:val="20"/>
+              </w:rPr>
+              <w:t>{{VALOR_UN</w:t>
+            </w:r>
+            <w:r>
+              <w:rPr>
+                <w:spacing w:val="-2"/>
+                <w:sz w:val="20"/>
+              </w:rPr>
+              <w:t>_7</w:t>
+            </w:r>
+            <w:r>
+              <w:rPr>
+                <w:spacing w:val="-2"/>
+                <w:sz w:val="20"/>
+              </w:rPr>
+              <w:t>}}</w:t>
+            </w:r>
+          </w:p>
+        </w:tc>
+        <w:tc>
+          <w:tcPr>
+            <w:tcW w:w="1020" w:type="dxa"/>
+          </w:tcPr>
+          <w:p>
+            <w:pPr>
+              <w:pStyle w:val="TableParagraph"/>
+              <w:ind w:left="41"/>
+              <w:jc w:val="center"/>
+              <w:rPr>
+                <w:spacing w:val="-5"/>
+                <w:sz w:val="20"/>
+              </w:rPr>
+            </w:pPr>
+            <w:r>
+              <w:rPr>
+                <w:spacing w:val="-5"/>
+                <w:sz w:val="20"/>
+              </w:rPr>
+              <w:t>{{QTD</w:t>
+            </w:r>
+            <w:r>
+              <w:rPr>
+                <w:spacing w:val="-5"/>
+                <w:sz w:val="20"/>
+              </w:rPr>
+              <w:t>_</w:t>
+            </w:r>
+            <w:r>
+              <w:rPr>
+                <w:spacing w:val="-5"/>
+                <w:sz w:val="20"/>
+              </w:rPr>
+              <w:t>7</w:t>
+            </w:r>
+            <w:r>
+              <w:rPr>
+                <w:spacing w:val="-5"/>
+                <w:sz w:val="20"/>
+              </w:rPr>
+              <w:t>}}</w:t>
+            </w:r>
+          </w:p>
+        </w:tc>
+        <w:tc>
+          <w:tcPr>
+            <w:tcW w:w="1546" w:type="dxa"/>
+            <w:tcBorders>
+              <w:right w:val="nil"/>
+            </w:tcBorders>
+          </w:tcPr>
+          <w:p>
+            <w:pPr>
+              <w:pStyle w:val="TableParagraph"/>
+              <w:rPr>
+                <w:spacing w:val="-1"/>
+                <w:sz w:val="20"/>
+              </w:rPr>
+            </w:pPr>
+            <w:r>
+              <w:rPr>
+                <w:spacing w:val="-1"/>
+                <w:sz w:val="20"/>
+              </w:rPr>
+              <w:t xml:space="preserve"> </w:t>
+            </w:r>
+            <w:r>
+              <w:rPr>
+                <w:spacing w:val="-2"/>
+                <w:sz w:val="20"/>
+              </w:rPr>
+              <w:t>{{VALOR_TOTAL</w:t>
+            </w:r>
+            <w:r>
+              <w:rPr>
+                <w:spacing w:val="-2"/>
+                <w:sz w:val="20"/>
+              </w:rPr>
+              <w:t>_</w:t>
+            </w:r>
+            <w:r>
+              <w:rPr>
+                <w:spacing w:val="-2"/>
+                <w:sz w:val="20"/>
+              </w:rPr>
+              <w:t>7</w:t>
+            </w:r>
+            <w:r>
+              <w:rPr>
+                <w:spacing w:val="-2"/>
+                <w:sz w:val="20"/>
+              </w:rPr>
+              <w:t>}}</w:t>
+            </w:r>
+          </w:p>
+        </w:tc>
+      </w:tr>
+      <w:tr>
+        <w:trPr>
+          <w:trHeight w:val="1747"/>
+        </w:trPr>
+        <w:tc>
+          <w:tcPr>
+            <w:tcW w:w="1983" w:type="dxa"/>
+            <w:tcBorders>
+              <w:left w:val="nil"/>
+            </w:tcBorders>
+          </w:tcPr>
+          <w:p>
+            <w:pPr>
+              <w:pStyle w:val="TableParagraph"/>
+              <w:ind w:left="196" w:right="224" w:hanging="4"/>
+              <w:jc w:val="center"/>
+              <w:rPr>
+                <w:sz w:val="20"/>
+              </w:rPr>
+            </w:pPr>
+            <w:r>
+              <w:rPr>
+                <w:sz w:val="20"/>
+              </w:rPr>
+              <w:t>{{SERVICO</w:t>
+            </w:r>
+            <w:r>
+              <w:rPr>
+                <w:sz w:val="20"/>
+              </w:rPr>
+              <w:t>_8</w:t>
+            </w:r>
+            <w:r>
+              <w:rPr>
+                <w:sz w:val="20"/>
+              </w:rPr>
+              <w:t>}}</w:t>
+            </w:r>
+          </w:p>
+        </w:tc>
+        <w:tc>
+          <w:tcPr>
+            <w:tcW w:w="2872" w:type="dxa"/>
+          </w:tcPr>
+          <w:p>
+            <w:pPr>
+              <w:pStyle w:val="TableParagraph"/>
+              <w:spacing w:before="0" w:line="227" w:lineRule="exact"/>
+              <w:ind w:left="33"/>
+              <w:rPr>
+                <w:sz w:val="20"/>
+              </w:rPr>
+            </w:pPr>
+            <w:r>
+              <w:rPr>
+                <w:sz w:val="20"/>
+              </w:rPr>
+              <w:t>{{DESCRICAO</w:t>
+            </w:r>
+            <w:r>
+              <w:rPr>
+                <w:sz w:val="20"/>
+              </w:rPr>
+              <w:t>_8</w:t>
+            </w:r>
+            <w:r>
+              <w:rPr>
+                <w:sz w:val="20"/>
+              </w:rPr>
+              <w:t>}}</w:t>
+            </w:r>
+          </w:p>
+        </w:tc>
+        <w:tc>
+          <w:tcPr>
+            <w:tcW w:w="1719" w:type="dxa"/>
+          </w:tcPr>
+          <w:p>
+            <w:pPr>
+              <w:pStyle w:val="TableParagraph"/>
+              <w:ind w:left="340" w:right="324" w:hanging="77"/>
+              <w:rPr>
+                <w:sz w:val="20"/>
+              </w:rPr>
+            </w:pPr>
+            <w:r>
+              <w:rPr>
+                <w:sz w:val="20"/>
+              </w:rPr>
+              <w:t>{{UNIDADE</w:t>
+            </w:r>
+            <w:r>
+              <w:rPr>
+                <w:sz w:val="20"/>
+              </w:rPr>
+              <w:t>_8</w:t>
+            </w:r>
+            <w:r>
+              <w:rPr>
+                <w:sz w:val="20"/>
+              </w:rPr>
+              <w:t>}}</w:t>
+            </w:r>
+          </w:p>
+        </w:tc>
+        <w:tc>
+          <w:tcPr>
+            <w:tcW w:w="1321" w:type="dxa"/>
+          </w:tcPr>
+          <w:p>
+            <w:pPr>
+              <w:pStyle w:val="TableParagraph"/>
+              <w:rPr>
+                <w:spacing w:val="-3"/>
+                <w:sz w:val="20"/>
+              </w:rPr>
+            </w:pPr>
+            <w:r>
+              <w:rPr>
+                <w:spacing w:val="-3"/>
+                <w:sz w:val="20"/>
+              </w:rPr>
+              <w:t xml:space="preserve"> </w:t>
+            </w:r>
+            <w:r>
+              <w:rPr>
+                <w:spacing w:val="-2"/>
+                <w:sz w:val="20"/>
+              </w:rPr>
+              <w:t>{{VALOR_UN</w:t>
+            </w:r>
+            <w:r>
+              <w:rPr>
+                <w:spacing w:val="-2"/>
+                <w:sz w:val="20"/>
+              </w:rPr>
+              <w:t>_8</w:t>
+            </w:r>
+            <w:r>
+              <w:rPr>
+                <w:spacing w:val="-2"/>
+                <w:sz w:val="20"/>
+              </w:rPr>
+              <w:t>}}</w:t>
+            </w:r>
+          </w:p>
+        </w:tc>
+        <w:tc>
+          <w:tcPr>
+            <w:tcW w:w="1020" w:type="dxa"/>
+          </w:tcPr>
+          <w:p>
+            <w:pPr>
+              <w:pStyle w:val="TableParagraph"/>
+              <w:ind w:left="41"/>
+              <w:jc w:val="center"/>
+              <w:rPr>
+                <w:spacing w:val="-5"/>
+                <w:sz w:val="20"/>
+              </w:rPr>
+            </w:pPr>
+            <w:r>
+              <w:rPr>
+                <w:spacing w:val="-5"/>
+                <w:sz w:val="20"/>
+              </w:rPr>
+              <w:t>{{QTD</w:t>
+            </w:r>
+            <w:r>
+              <w:rPr>
+                <w:spacing w:val="-5"/>
+                <w:sz w:val="20"/>
+              </w:rPr>
+              <w:t>_8</w:t>
+            </w:r>
+            <w:r>
+              <w:rPr>
+                <w:spacing w:val="-5"/>
+                <w:sz w:val="20"/>
+              </w:rPr>
+              <w:t>}}</w:t>
+            </w:r>
+          </w:p>
+        </w:tc>
+        <w:tc>
+          <w:tcPr>
+            <w:tcW w:w="1546" w:type="dxa"/>
+            <w:tcBorders>
+              <w:right w:val="nil"/>
+            </w:tcBorders>
+          </w:tcPr>
+          <w:p>
+            <w:pPr>
+              <w:pStyle w:val="TableParagraph"/>
+              <w:rPr>
+                <w:spacing w:val="-1"/>
+                <w:sz w:val="20"/>
+              </w:rPr>
+            </w:pPr>
+            <w:r>
+              <w:rPr>
+                <w:spacing w:val="-1"/>
+                <w:sz w:val="20"/>
+              </w:rPr>
+              <w:t xml:space="preserve"> </w:t>
+            </w:r>
+            <w:r>
+              <w:rPr>
+                <w:spacing w:val="-2"/>
+                <w:sz w:val="20"/>
+              </w:rPr>
+              <w:t>{{VALOR_TOTAL</w:t>
+            </w:r>
+            <w:r>
+              <w:rPr>
+                <w:spacing w:val="-2"/>
+                <w:sz w:val="20"/>
+              </w:rPr>
+              <w:t>_8</w:t>
+            </w:r>
+            <w:r>
+              <w:rPr>
+                <w:spacing w:val="-2"/>
+                <w:sz w:val="20"/>
+              </w:rPr>
+              <w:t>}}</w:t>
+            </w:r>
+          </w:p>
+        </w:tc>
+      </w:tr>
+      <w:tr>
+        <w:trPr>
+          <w:trHeight w:val="1747"/>
+        </w:trPr>
+        <w:tc>
+          <w:tcPr>
+            <w:tcW w:w="1983" w:type="dxa"/>
+            <w:tcBorders>
+              <w:left w:val="nil"/>
+            </w:tcBorders>
+          </w:tcPr>
+          <w:p>
+            <w:pPr>
+              <w:pStyle w:val="TableParagraph"/>
+              <w:ind w:left="196" w:right="224" w:hanging="4"/>
+              <w:jc w:val="center"/>
+              <w:rPr>
+                <w:sz w:val="20"/>
+              </w:rPr>
+            </w:pPr>
+            <w:r>
+              <w:rPr>
+                <w:sz w:val="20"/>
+              </w:rPr>
+              <w:t>{{SERVICO</w:t>
+            </w:r>
+            <w:r>
+              <w:rPr>
+                <w:sz w:val="20"/>
+              </w:rPr>
+              <w:t>_9</w:t>
+            </w:r>
+            <w:r>
+              <w:rPr>
+                <w:sz w:val="20"/>
+              </w:rPr>
+              <w:t>}}</w:t>
+            </w:r>
+          </w:p>
+        </w:tc>
+        <w:tc>
+          <w:tcPr>
+            <w:tcW w:w="2872" w:type="dxa"/>
+          </w:tcPr>
+          <w:p>
+            <w:pPr>
+              <w:pStyle w:val="TableParagraph"/>
+              <w:spacing w:before="0" w:line="227" w:lineRule="exact"/>
+              <w:ind w:left="33"/>
+              <w:rPr>
+                <w:sz w:val="20"/>
+              </w:rPr>
+            </w:pPr>
+            <w:r>
+              <w:rPr>
+                <w:sz w:val="20"/>
+              </w:rPr>
+              <w:t>{{DESCRICAO</w:t>
+            </w:r>
+            <w:r>
+              <w:rPr>
+                <w:sz w:val="20"/>
+              </w:rPr>
+              <w:t>_9</w:t>
+            </w:r>
+            <w:r>
+              <w:rPr>
+                <w:sz w:val="20"/>
+              </w:rPr>
+              <w:t>}}</w:t>
+            </w:r>
+          </w:p>
+        </w:tc>
+        <w:tc>
+          <w:tcPr>
+            <w:tcW w:w="1719" w:type="dxa"/>
+          </w:tcPr>
+          <w:p>
+            <w:pPr>
+              <w:pStyle w:val="TableParagraph"/>
+              <w:ind w:left="340" w:right="324" w:hanging="77"/>
+              <w:rPr>
+                <w:sz w:val="20"/>
+              </w:rPr>
+            </w:pPr>
+            <w:r>
+              <w:rPr>
+                <w:sz w:val="20"/>
+              </w:rPr>
+              <w:t>{{UNIDADE</w:t>
+            </w:r>
+            <w:r>
+              <w:rPr>
+                <w:sz w:val="20"/>
+              </w:rPr>
+              <w:t>_9</w:t>
+            </w:r>
+            <w:r>
+              <w:rPr>
+                <w:sz w:val="20"/>
+              </w:rPr>
+              <w:t>}}</w:t>
+            </w:r>
+          </w:p>
+        </w:tc>
+        <w:tc>
+          <w:tcPr>
+            <w:tcW w:w="1321" w:type="dxa"/>
+          </w:tcPr>
+          <w:p>
+            <w:pPr>
+              <w:pStyle w:val="TableParagraph"/>
+              <w:rPr>
+                <w:spacing w:val="-3"/>
+                <w:sz w:val="20"/>
+              </w:rPr>
+            </w:pPr>
+            <w:r>
+              <w:rPr>
+                <w:spacing w:val="-3"/>
+                <w:sz w:val="20"/>
+              </w:rPr>
+              <w:t xml:space="preserve"> </w:t>
+            </w:r>
+            <w:r>
+              <w:rPr>
+                <w:spacing w:val="-2"/>
+                <w:sz w:val="20"/>
+              </w:rPr>
+              <w:t>{{VALOR_UN</w:t>
+            </w:r>
+            <w:r>
+              <w:rPr>
+                <w:spacing w:val="-2"/>
+                <w:sz w:val="20"/>
+              </w:rPr>
+              <w:t>_9</w:t>
+            </w:r>
+            <w:r>
+              <w:rPr>
+                <w:spacing w:val="-2"/>
+                <w:sz w:val="20"/>
+              </w:rPr>
+              <w:t>}}</w:t>
+            </w:r>
+          </w:p>
+        </w:tc>
+        <w:tc>
+          <w:tcPr>
+            <w:tcW w:w="1020" w:type="dxa"/>
+          </w:tcPr>
+          <w:p>
+            <w:pPr>
+              <w:pStyle w:val="TableParagraph"/>
+              <w:ind w:left="41"/>
+              <w:jc w:val="center"/>
+              <w:rPr>
+                <w:spacing w:val="-5"/>
+                <w:sz w:val="20"/>
+              </w:rPr>
+            </w:pPr>
+            <w:r>
+              <w:rPr>
+                <w:spacing w:val="-5"/>
+                <w:sz w:val="20"/>
+              </w:rPr>
+              <w:t>{{QTD</w:t>
+            </w:r>
+            <w:r>
+              <w:rPr>
+                <w:spacing w:val="-5"/>
+                <w:sz w:val="20"/>
+              </w:rPr>
+              <w:t>_9</w:t>
+            </w:r>
+            <w:r>
+              <w:rPr>
+                <w:spacing w:val="-5"/>
+                <w:sz w:val="20"/>
+              </w:rPr>
+              <w:t>}}</w:t>
+            </w:r>
+          </w:p>
+        </w:tc>
+        <w:tc>
+          <w:tcPr>
+            <w:tcW w:w="1546" w:type="dxa"/>
+            <w:tcBorders>
+              <w:right w:val="nil"/>
+            </w:tcBorders>
+          </w:tcPr>
+          <w:p>
+            <w:pPr>
+              <w:pStyle w:val="TableParagraph"/>
+              <w:rPr>
+                <w:spacing w:val="-1"/>
+                <w:sz w:val="20"/>
+              </w:rPr>
+            </w:pPr>
+            <w:r>
+              <w:rPr>
+                <w:spacing w:val="-1"/>
+                <w:sz w:val="20"/>
+              </w:rPr>
+              <w:t xml:space="preserve"> </w:t>
+            </w:r>
+            <w:r>
+              <w:rPr>
+                <w:spacing w:val="-2"/>
+                <w:sz w:val="20"/>
+              </w:rPr>
+              <w:t>{{VALOR_TOTAL</w:t>
+            </w:r>
+            <w:r>
+              <w:rPr>
+                <w:spacing w:val="-2"/>
+                <w:sz w:val="20"/>
+              </w:rPr>
+              <w:t>_9</w:t>
+            </w:r>
+            <w:r>
+              <w:rPr>
+                <w:spacing w:val="-2"/>
+                <w:sz w:val="20"/>
+              </w:rPr>
+              <w:t>}}</w:t>
+            </w:r>
+          </w:p>
+        </w:tc>
+      </w:tr>
+      <w:tr>
+        <w:trPr>
+          <w:trHeight w:val="1747"/>
+        </w:trPr>
+        <w:tc>
+          <w:tcPr>
+            <w:tcW w:w="1983" w:type="dxa"/>
+            <w:tcBorders>
+              <w:left w:val="nil"/>
+            </w:tcBorders>
+          </w:tcPr>
+          <w:p>
+            <w:pPr>
+              <w:pStyle w:val="TableParagraph"/>
+              <w:ind w:left="196" w:right="224" w:hanging="4"/>
+              <w:jc w:val="center"/>
+              <w:rPr>
+                <w:sz w:val="20"/>
+              </w:rPr>
+            </w:pPr>
+            <w:r>
+              <w:rPr>
+                <w:sz w:val="20"/>
+              </w:rPr>
+              <w:t>{{SERVICO_10}}</w:t>
+            </w:r>
+          </w:p>
+        </w:tc>
+        <w:tc>
+          <w:tcPr>
+            <w:tcW w:w="2872" w:type="dxa"/>
+          </w:tcPr>
+          <w:p>
+            <w:pPr>
+              <w:pStyle w:val="TableParagraph"/>
+              <w:spacing w:before="0" w:line="227" w:lineRule="exact"/>
+              <w:ind w:left="33"/>
+              <w:rPr>
+                <w:sz w:val="20"/>
+              </w:rPr>
+            </w:pPr>
+            <w:r>
+              <w:rPr>
+                <w:sz w:val="20"/>
+              </w:rPr>
+              <w:t>{{DESCRICAO</w:t>
+            </w:r>
+            <w:r>
+              <w:rPr>
+                <w:sz w:val="20"/>
+              </w:rPr>
+              <w:t>_</w:t>
+            </w:r>
+            <w:r>
+              <w:rPr>
+                <w:sz w:val="20"/>
+              </w:rPr>
+              <w:t>10</w:t>
+            </w:r>
+            <w:r>
+              <w:rPr>
+                <w:sz w:val="20"/>
+              </w:rPr>
+              <w:t>}}</w:t>
+            </w:r>
+          </w:p>
+        </w:tc>
+        <w:tc>
+          <w:tcPr>
+            <w:tcW w:w="1719" w:type="dxa"/>
+          </w:tcPr>
+          <w:p>
+            <w:pPr>
+              <w:pStyle w:val="TableParagraph"/>
+              <w:ind w:left="340" w:right="324" w:hanging="77"/>
+              <w:rPr>
+                <w:sz w:val="20"/>
+              </w:rPr>
+            </w:pPr>
+            <w:r>
+              <w:rPr>
+                <w:sz w:val="20"/>
+              </w:rPr>
+              <w:t>{{UNIDADE</w:t>
+            </w:r>
+            <w:r>
+              <w:rPr>
+                <w:sz w:val="20"/>
+              </w:rPr>
+              <w:t>_</w:t>
+            </w:r>
+            <w:r>
+              <w:rPr>
+                <w:sz w:val="20"/>
+              </w:rPr>
+              <w:t>10</w:t>
+            </w:r>
+            <w:r>
+              <w:rPr>
+                <w:sz w:val="20"/>
+              </w:rPr>
+              <w:t>}}</w:t>
+            </w:r>
+          </w:p>
+        </w:tc>
+        <w:tc>
+          <w:tcPr>
+            <w:tcW w:w="1321" w:type="dxa"/>
+          </w:tcPr>
+          <w:p>
+            <w:pPr>
+              <w:pStyle w:val="TableParagraph"/>
+              <w:rPr>
+                <w:spacing w:val="-3"/>
+                <w:sz w:val="20"/>
+              </w:rPr>
+            </w:pPr>
+            <w:r>
+              <w:rPr>
+                <w:spacing w:val="-3"/>
+                <w:sz w:val="20"/>
+              </w:rPr>
+              <w:t xml:space="preserve"> </w:t>
+            </w:r>
+            <w:r>
+              <w:rPr>
+                <w:spacing w:val="-2"/>
+                <w:sz w:val="20"/>
+              </w:rPr>
+              <w:t>{{VALOR_UN</w:t>
+            </w:r>
+            <w:r>
+              <w:rPr>
+                <w:spacing w:val="-2"/>
+                <w:sz w:val="20"/>
+              </w:rPr>
+              <w:t>_</w:t>
+            </w:r>
+            <w:r>
+              <w:rPr>
+                <w:spacing w:val="-2"/>
+                <w:sz w:val="20"/>
+              </w:rPr>
+              <w:t>10</w:t>
+            </w:r>
+            <w:r>
+              <w:rPr>
+                <w:spacing w:val="-2"/>
+                <w:sz w:val="20"/>
+              </w:rPr>
+              <w:t>}}</w:t>
+            </w:r>
+          </w:p>
+        </w:tc>
+        <w:tc>
+          <w:tcPr>
+            <w:tcW w:w="1020" w:type="dxa"/>
+          </w:tcPr>
+          <w:p>
+            <w:pPr>
+              <w:pStyle w:val="TableParagraph"/>
+              <w:ind w:left="41"/>
+              <w:jc w:val="center"/>
+              <w:rPr>
+                <w:spacing w:val="-5"/>
+                <w:sz w:val="20"/>
+              </w:rPr>
+            </w:pPr>
+            <w:r>
+              <w:rPr>
+                <w:spacing w:val="-5"/>
+                <w:sz w:val="20"/>
+              </w:rPr>
+              <w:t>{{QTD</w:t>
+            </w:r>
+            <w:r>
+              <w:rPr>
+                <w:spacing w:val="-5"/>
+                <w:sz w:val="20"/>
+              </w:rPr>
+              <w:t>_</w:t>
+            </w:r>
+            <w:r>
+              <w:rPr>
+                <w:spacing w:val="-5"/>
+                <w:sz w:val="20"/>
+              </w:rPr>
+              <w:t>10</w:t>
+            </w:r>
+            <w:r>
+              <w:rPr>
+                <w:spacing w:val="-5"/>
+                <w:sz w:val="20"/>
+              </w:rPr>
+              <w:t>}}</w:t>
+            </w:r>
+          </w:p>
+        </w:tc>
+        <w:tc>
+          <w:tcPr>
+            <w:tcW w:w="1546" w:type="dxa"/>
+            <w:tcBorders>
+              <w:right w:val="nil"/>
+            </w:tcBorders>
+          </w:tcPr>
+          <w:p>
+            <w:pPr>
+              <w:pStyle w:val="TableParagraph"/>
+              <w:rPr>
+                <w:spacing w:val="-1"/>
+                <w:sz w:val="20"/>
+              </w:rPr>
+            </w:pPr>
+            <w:r>
+              <w:rPr>
+                <w:spacing w:val="-2"/>
+                <w:sz w:val="20"/>
+              </w:rPr>
+              <w:t>{{VALOR_TOTAL</w:t>
+            </w:r>
+            <w:r>
+              <w:rPr>
+                <w:spacing w:val="-2"/>
+                <w:sz w:val="20"/>
+              </w:rPr>
+              <w:t>_</w:t>
+            </w:r>
+            <w:r>
+              <w:rPr>
+                <w:spacing w:val="-2"/>
+                <w:sz w:val="20"/>
+              </w:rPr>
+              <w:t>10</w:t>
+            </w:r>
+            <w:r>
+              <w:rPr>
+                <w:spacing w:val="-2"/>
+                <w:sz w:val="20"/>
+              </w:rPr>
+              <w:t>}}</w:t>
             </w:r>
           </w:p>
         </w:tc>
@@ -1519,7 +3696,6 @@
               <w:pStyle w:val="TableParagraph"/>
               <w:spacing w:before="44"/>
               <w:ind w:right="289"/>
-              <w:jc w:val="right"/>
               <w:rPr>
                 <w:b/>
                 <w:bCs/>
@@ -1533,7 +3709,16 @@
                 <w:spacing w:val="-2"/>
                 <w:sz w:val="20"/>
               </w:rPr>
-              <w:t>{{VALOR_TOTAL}}</w:t>
+              <w:t>{{VALOR_GLOBAL</w:t>
+            </w:r>
+            <w:r>
+              <w:rPr>
+                <w:b/>
+                <w:bCs/>
+                <w:spacing w:val="-2"/>
+                <w:sz w:val="20"/>
+              </w:rPr>
+              <w:t>}}</w:t>
             </w:r>
           </w:p>
         </w:tc>
@@ -1667,6 +3852,16 @@
                 <w:sz w:val="20"/>
               </w:rPr>
               <w:t>Desconto:</w:t>
+            </w:r>
+            <w:r>
+              <w:t xml:space="preserve"> </w:t>
+            </w:r>
+            <w:r>
+              <w:rPr>
+                <w:spacing w:val="-2"/>
+                <w:sz w:val="20"/>
+              </w:rPr>
+              <w:t>{{DESCONTO}}</w:t>
             </w:r>
           </w:p>
         </w:tc>
@@ -1891,7 +4086,7 @@
                 <w:spacing w:val="-2"/>
                 <w:sz w:val="20"/>
               </w:rPr>
-              <w:t>{{VALOR_TOTAL}}</w:t>
+              <w:t>{{VALOR_FINAL}}</w:t>
             </w:r>
           </w:p>
         </w:tc>
@@ -22447,7 +24642,29 @@
                               <w:szCs w:val="21"/>
                               <w:lang w:val="pt-BR" w:eastAsia="pt-BR"/>
                             </w:rPr>
-                            <w:t>{{NUMERO_DA_PROPOSTA}}</w:t>
+                            <w:t>{{</w:t>
+                          </w:r>
+                          <w:proofErr w:type="gramStart"/>
+                          <w:r>
+                            <w:rPr>
+                              <w:rFonts w:ascii="Consolas" w:eastAsia="Times New Roman" w:hAnsi="Consolas" w:cs="Times New Roman"/>
+                              <w:color w:val="FF7B72"/>
+                              <w:sz w:val="21"/>
+                              <w:szCs w:val="21"/>
+                              <w:lang w:val="pt-BR" w:eastAsia="pt-BR"/>
+                            </w:rPr>
+                            <w:t>NUMERO</w:t>
+                          </w:r>
+                          <w:proofErr w:type="gramEnd"/>
+                          <w:r>
+                            <w:rPr>
+                              <w:rFonts w:ascii="Consolas" w:eastAsia="Times New Roman" w:hAnsi="Consolas" w:cs="Times New Roman"/>
+                              <w:color w:val="FF7B72"/>
+                              <w:sz w:val="21"/>
+                              <w:szCs w:val="21"/>
+                              <w:lang w:val="pt-BR" w:eastAsia="pt-BR"/>
+                            </w:rPr>
+                            <w:t>_DA_PROPOSTA}}</w:t>
                           </w:r>
                         </w:p>
                         <w:p>
@@ -22470,7 +24687,29 @@
                               <w:szCs w:val="21"/>
                               <w:lang w:val="pt-BR" w:eastAsia="pt-BR"/>
                             </w:rPr>
-                            <w:t>{{NUMERO_DA_PROPOSTA}}</w:t>
+                            <w:t>{{</w:t>
+                          </w:r>
+                          <w:proofErr w:type="gramStart"/>
+                          <w:r>
+                            <w:rPr>
+                              <w:rFonts w:ascii="Consolas" w:eastAsia="Times New Roman" w:hAnsi="Consolas" w:cs="Times New Roman"/>
+                              <w:color w:val="FF7B72"/>
+                              <w:sz w:val="21"/>
+                              <w:szCs w:val="21"/>
+                              <w:lang w:val="pt-BR" w:eastAsia="pt-BR"/>
+                            </w:rPr>
+                            <w:t>NUMERO</w:t>
+                          </w:r>
+                          <w:proofErr w:type="gramEnd"/>
+                          <w:r>
+                            <w:rPr>
+                              <w:rFonts w:ascii="Consolas" w:eastAsia="Times New Roman" w:hAnsi="Consolas" w:cs="Times New Roman"/>
+                              <w:color w:val="FF7B72"/>
+                              <w:sz w:val="21"/>
+                              <w:szCs w:val="21"/>
+                              <w:lang w:val="pt-BR" w:eastAsia="pt-BR"/>
+                            </w:rPr>
+                            <w:t>_DA_PROPOSTA}}</w:t>
                           </w:r>
                         </w:p>
                         <w:p>
@@ -22493,7 +24732,29 @@
                               <w:spacing w:val="-2"/>
                               <w:lang w:val="pt-BR"/>
                             </w:rPr>
-                            <w:t>{{NUMERO_DA_PROPOSTA}}</w:t>
+                            <w:t>{{</w:t>
+                          </w:r>
+                          <w:proofErr w:type="gramStart"/>
+                          <w:r>
+                            <w:rPr>
+                              <w:b/>
+                              <w:i/>
+                              <w:color w:val="696969"/>
+                              <w:spacing w:val="-2"/>
+                              <w:lang w:val="pt-BR"/>
+                            </w:rPr>
+                            <w:t>NUMERO</w:t>
+                          </w:r>
+                          <w:proofErr w:type="gramEnd"/>
+                          <w:r>
+                            <w:rPr>
+                              <w:b/>
+                              <w:i/>
+                              <w:color w:val="696969"/>
+                              <w:spacing w:val="-2"/>
+                              <w:lang w:val="pt-BR"/>
+                            </w:rPr>
+                            <w:t>_DA_PROPOSTA}}</w:t>
                           </w:r>
                         </w:p>
                         <w:p>
@@ -25020,6 +27281,19 @@
       <w:lang w:val="pt-PT"/>
     </w:rPr>
   </w:style>
+  <w:style w:type="character" w:styleId="CdigoHTML">
+    <w:name w:val="HTML Code"/>
+    <w:basedOn w:val="Fontepargpadro"/>
+    <w:uiPriority w:val="99"/>
+    <w:semiHidden/>
+    <w:unhideWhenUsed/>
+    <w:rsid w:val="00B74649"/>
+    <w:rPr>
+      <w:rFonts w:ascii="Courier New" w:eastAsia="Times New Roman" w:hAnsi="Courier New" w:cs="Courier New"/>
+      <w:sz w:val="20"/>
+      <w:szCs w:val="20"/>
+    </w:rPr>
+  </w:style>
 </w:styles>
 </file>
 

</xml_diff>